<commit_message>
chore: snapshot before reranker provider update
</commit_message>
<xml_diff>
--- a/resources/review_criteria/criteria.docx
+++ b/resources/review_criteria/criteria.docx
@@ -15,19 +15,58 @@
     </w:p>
     <w:p>
       <w:pPr>
+        <w:pStyle w:val="a8"/>
+        <w:numPr>
+          <w:ilvl w:val="0"/>
+          <w:numId w:val="3"/>
+        </w:numPr>
+        <w:ind w:firstLineChars="0"/>
+      </w:pPr>
+      <w:r>
+        <w:rPr>
+          <w:rFonts w:hint="eastAsia"/>
+        </w:rPr>
+        <w:t>合同主体</w:t>
+      </w:r>
+    </w:p>
+    <w:p>
+      <w:pPr>
+        <w:pStyle w:val="criteria"/>
+      </w:pPr>
+      <w:r>
+        <w:rPr>
+          <w:rFonts w:hint="eastAsia"/>
+        </w:rPr>
+        <w:t>核对经营范围，合同标的是否在经营范围之内；</w:t>
+      </w:r>
+    </w:p>
+    <w:p>
+      <w:pPr>
+        <w:pStyle w:val="criteria"/>
+      </w:pPr>
+      <w:r>
+        <w:rPr>
+          <w:rFonts w:hint="eastAsia"/>
+          <w:highlight w:val="yellow"/>
+        </w:rPr>
+        <w:t>合同提供信息是否齐全，包括联系地址、联系电话、传真、法定代表人或负责人、联系人等信息。</w:t>
+      </w:r>
+    </w:p>
+    <w:p>
+      <w:pPr>
         <w:ind w:firstLineChars="100"/>
       </w:pPr>
       <w:r>
         <w:rPr>
           <w:rFonts w:hint="eastAsia"/>
         </w:rPr>
-        <w:t>一、</w:t>
-      </w:r>
-      <w:r>
-        <w:rPr>
-          <w:rFonts w:hint="eastAsia"/>
-        </w:rPr>
-        <w:t>合同主体</w:t>
+        <w:t>二、</w:t>
+      </w:r>
+      <w:r>
+        <w:rPr>
+          <w:rFonts w:hint="eastAsia"/>
+        </w:rPr>
+        <w:t>合同框架</w:t>
       </w:r>
     </w:p>
     <w:p>
@@ -38,549 +77,364 @@
         <w:rPr>
           <w:rFonts w:hint="eastAsia"/>
         </w:rPr>
-        <w:t>1</w:t>
-      </w:r>
-      <w:r>
-        <w:t>.</w:t>
-      </w:r>
-      <w:r>
-        <w:rPr>
-          <w:rFonts w:hint="eastAsia"/>
-        </w:rPr>
-        <w:t>核对经营范围，合同标的是否在经营范围之内；</w:t>
+        <w:t>合同采购内容、合同金额、付款计划、合同期限、生效条件、</w:t>
+      </w:r>
+      <w:r>
+        <w:rPr>
+          <w:rFonts w:hint="eastAsia"/>
+        </w:rPr>
+        <w:t>知识产权约定或产品质量保证条款、</w:t>
+      </w:r>
+      <w:r>
+        <w:rPr>
+          <w:rFonts w:hint="eastAsia"/>
+        </w:rPr>
+        <w:t>保密条款、</w:t>
+      </w:r>
+      <w:r>
+        <w:rPr>
+          <w:rFonts w:hint="eastAsia"/>
+        </w:rPr>
+        <w:t>交付条款、</w:t>
+      </w:r>
+      <w:r>
+        <w:rPr>
+          <w:rFonts w:hint="eastAsia"/>
+        </w:rPr>
+        <w:t>验收条款、完成时限、</w:t>
+      </w:r>
+      <w:r>
+        <w:rPr>
+          <w:rFonts w:hint="eastAsia"/>
+        </w:rPr>
+        <w:t>违约责任、</w:t>
+      </w:r>
+      <w:r>
+        <w:rPr>
+          <w:rFonts w:hint="eastAsia"/>
+        </w:rPr>
+        <w:t>合同解除、</w:t>
+      </w:r>
+      <w:r>
+        <w:rPr>
+          <w:rFonts w:hint="eastAsia"/>
+        </w:rPr>
+        <w:t>司法管辖、不可抗力、廉洁承诺</w:t>
+      </w:r>
+      <w:r>
+        <w:rPr>
+          <w:rFonts w:hint="eastAsia"/>
+        </w:rPr>
+        <w:t>、合同变更</w:t>
+      </w:r>
+      <w:r>
+        <w:rPr>
+          <w:rFonts w:hint="eastAsia"/>
+        </w:rPr>
+        <w:t>、合同份数、电子送达约定</w:t>
+      </w:r>
+      <w:r>
+        <w:rPr>
+          <w:rFonts w:hint="eastAsia"/>
+        </w:rPr>
+        <w:t>等是否完整</w:t>
+      </w:r>
+    </w:p>
+    <w:p>
+      <w:pPr>
+        <w:pStyle w:val="criteria"/>
+        <w:numPr>
+          <w:ilvl w:val="0"/>
+          <w:numId w:val="6"/>
+        </w:numPr>
+        <w:ind w:left="255" w:hanging="57"/>
+        <w:rPr>
+          <w:rFonts w:hint="eastAsia"/>
+        </w:rPr>
+      </w:pPr>
+      <w:r>
+        <w:rPr>
+          <w:rFonts w:hint="eastAsia"/>
+        </w:rPr>
+        <w:t>合同首部及基础信息是否填写完整，包括合同编号、签订日期、签约主体、联系方式、统一社会信用代码、收付款账户等</w:t>
+      </w:r>
+    </w:p>
+    <w:p>
+      <w:pPr>
+        <w:pStyle w:val="criteria"/>
+      </w:pPr>
+      <w:r>
+        <w:rPr>
+          <w:rFonts w:hint="eastAsia"/>
+        </w:rPr>
+        <w:t>合同主要项目负责人是否确定、是否预留</w:t>
+      </w:r>
+      <w:r>
+        <w:rPr>
+          <w:rFonts w:hint="eastAsia"/>
+        </w:rPr>
+        <w:t>姓名、身份证号码及电话号码</w:t>
+      </w:r>
+    </w:p>
+    <w:p>
+      <w:pPr>
+        <w:pStyle w:val="criteria"/>
+      </w:pPr>
+      <w:r>
+        <w:rPr>
+          <w:rFonts w:hint="eastAsia"/>
+        </w:rPr>
+        <w:t>采购内容：</w:t>
+      </w:r>
+      <w:r>
+        <w:rPr>
+          <w:rFonts w:hint="eastAsia"/>
+        </w:rPr>
+        <w:t>品种、规格、型号、等级、花色等应具体注明，必要时可通过附件说明标的物的实际情况。</w:t>
+      </w:r>
+    </w:p>
+    <w:p>
+      <w:pPr>
+        <w:pStyle w:val="criteria"/>
+      </w:pPr>
+      <w:r>
+        <w:rPr>
+          <w:rFonts w:hint="eastAsia"/>
+        </w:rPr>
+        <w:t>合同金额：</w:t>
+      </w:r>
+      <w:r>
+        <w:rPr>
+          <w:rFonts w:hint="eastAsia"/>
+        </w:rPr>
+        <w:t>数量、价款要明确，包括数额的计量单位，同时写明标的物的单价、总价，币种等</w:t>
+      </w:r>
+      <w:r>
+        <w:rPr>
+          <w:rFonts w:hint="eastAsia"/>
+        </w:rPr>
+        <w:t>，</w:t>
+      </w:r>
+      <w:r>
+        <w:rPr>
+          <w:highlight w:val="yellow"/>
+        </w:rPr>
+        <w:t>如合同标的可能因外部因素调整数量</w:t>
+      </w:r>
+      <w:r>
+        <w:rPr>
+          <w:highlight w:val="yellow"/>
+        </w:rPr>
+        <w:t>/</w:t>
+      </w:r>
+      <w:r>
+        <w:rPr>
+          <w:highlight w:val="yellow"/>
+        </w:rPr>
+        <w:t>范围（如展位面积、服务量），应约定相应价款调整机制</w:t>
+      </w:r>
+      <w:r>
+        <w:rPr>
+          <w:rFonts w:hint="eastAsia"/>
+          <w:highlight w:val="yellow"/>
+        </w:rPr>
+        <w:t>。</w:t>
+      </w:r>
+    </w:p>
+    <w:p>
+      <w:pPr>
+        <w:pStyle w:val="criteria"/>
+      </w:pPr>
+      <w:r>
+        <w:rPr>
+          <w:rFonts w:hint="eastAsia"/>
+        </w:rPr>
+        <w:t>付款计划：要有明确节点确认付款，应预留一部分金额待免费维保期结束后支付，且明确发票类型</w:t>
+      </w:r>
+    </w:p>
+    <w:p>
+      <w:pPr>
+        <w:pStyle w:val="criteria"/>
+      </w:pPr>
+      <w:r>
+        <w:rPr>
+          <w:rFonts w:hint="eastAsia"/>
+        </w:rPr>
+        <w:t>合同期限：</w:t>
+      </w:r>
+      <w:r>
+        <w:rPr>
+          <w:rFonts w:hint="eastAsia"/>
+        </w:rPr>
+        <w:t>约定具体的合同履行期限，可按照年度、季度、月、旬、日计算；同时，明确各期限的概念，如自然日或工作日、自然季度或从起始日开始计算至第三个月同一日的前一天等，避免模棱两可的语言。</w:t>
+      </w:r>
+    </w:p>
+    <w:p>
+      <w:pPr>
+        <w:pStyle w:val="criteria"/>
+      </w:pPr>
+      <w:r>
+        <w:rPr>
+          <w:rFonts w:hint="eastAsia"/>
+        </w:rPr>
+        <w:t>完成时限：明确每一工作阶段应完成的工作内容，以及提交工作成果的形式。</w:t>
+      </w:r>
+    </w:p>
+    <w:p>
+      <w:pPr>
+        <w:pStyle w:val="criteria"/>
+      </w:pPr>
+      <w:r>
+        <w:rPr>
+          <w:rFonts w:hint="eastAsia"/>
+        </w:rPr>
+        <w:t>违约责任：</w:t>
+      </w:r>
+      <w:r>
+        <w:rPr>
+          <w:highlight w:val="yellow"/>
+        </w:rPr>
+        <w:t>合同应针对相对方可能的各类违约情形（如变更安排、安全保障、第三方权利主张、配合履约、保密违规、数据</w:t>
+      </w:r>
+      <w:r>
+        <w:rPr>
+          <w:highlight w:val="yellow"/>
+        </w:rPr>
+        <w:t>/</w:t>
+      </w:r>
+      <w:r>
+        <w:rPr>
+          <w:highlight w:val="yellow"/>
+        </w:rPr>
+        <w:t>人员管理不当、设备故障等）逐一约定相应违约责任、赔偿范围或救济机</w:t>
+      </w:r>
+      <w:r>
+        <w:rPr>
+          <w:highlight w:val="yellow"/>
+        </w:rPr>
+        <w:lastRenderedPageBreak/>
+        <w:t>制，并设置兜底条款覆盖未明确列举的其他违约情形；违约金比例、赔偿范围、责任上限应与合同金额、标的性质、项目重要性及可能损失相匹配。</w:t>
+      </w:r>
+    </w:p>
+    <w:p>
+      <w:pPr>
+        <w:pStyle w:val="criteria"/>
+      </w:pPr>
+      <w:r>
+        <w:rPr>
+          <w:rFonts w:hint="eastAsia"/>
+        </w:rPr>
+        <w:t>司法关系：由我方住所地人民法院管辖。</w:t>
+      </w:r>
+    </w:p>
+    <w:p>
+      <w:pPr>
+        <w:pStyle w:val="criteria"/>
+      </w:pPr>
+      <w:r>
+        <w:rPr>
+          <w:rFonts w:hint="eastAsia"/>
+          <w:highlight w:val="yellow"/>
+        </w:rPr>
+        <w:t>合同内部条款逻辑一致性：同一事项或同一违约情形在交付、验收、付款、解除、退款、违约责任、损失赔偿等条款中的约定应前后一致，避免触发条件不一致、责任后果冲突、引用不明或衔接不完整。</w:t>
+      </w:r>
+    </w:p>
+    <w:p>
+      <w:pPr>
+        <w:pStyle w:val="criteria"/>
+      </w:pPr>
+      <w:r>
+        <w:rPr>
+          <w:rFonts w:hint="eastAsia"/>
+          <w:highlight w:val="yellow"/>
+        </w:rPr>
+        <w:t>金钱担保机制完整性：合同如涉及履约保证金、押金、定金、质押、质保金等金钱担保机制，应该查该机制是否覆盖完整生命周期：缴纳时点与金额、调整或补充义务、退还条件与时点、各环节未履行时的违约责任。其中任一环节缺失应建议补充。</w:t>
       </w:r>
     </w:p>
     <w:p>
       <w:pPr>
         <w:ind w:firstLineChars="100"/>
-        <w:rPr>
-          <w:rFonts w:hint="eastAsia"/>
-        </w:rPr>
-      </w:pPr>
-      <w:r>
-        <w:rPr>
-          <w:rFonts w:hint="eastAsia"/>
-        </w:rPr>
-        <w:t>2</w:t>
-      </w:r>
-      <w:r>
-        <w:t>.</w:t>
-      </w:r>
-      <w:r>
-        <w:rPr>
-          <w:rFonts w:hint="eastAsia"/>
-          <w:highlight w:val="yellow"/>
-        </w:rPr>
-        <w:t>合同提供信息是否齐全，包括联系地址、联系电话、传真、法定代表人或负责人、联系人等</w:t>
-      </w:r>
-      <w:r>
-        <w:rPr>
-          <w:rFonts w:hint="eastAsia"/>
-          <w:highlight w:val="yellow"/>
-        </w:rPr>
-        <w:t>信息。</w:t>
-      </w:r>
-    </w:p>
-    <w:p>
-      <w:pPr>
-        <w:ind w:firstLineChars="100"/>
-      </w:pPr>
-      <w:r>
-        <w:rPr>
-          <w:rFonts w:hint="eastAsia"/>
-        </w:rPr>
-        <w:t>二、</w:t>
-      </w:r>
-      <w:r>
-        <w:rPr>
-          <w:rFonts w:hint="eastAsia"/>
-        </w:rPr>
-        <w:t>合同框架</w:t>
-      </w:r>
-    </w:p>
-    <w:p>
-      <w:pPr>
-        <w:ind w:firstLineChars="100"/>
-      </w:pPr>
-      <w:r>
-        <w:rPr>
-          <w:rFonts w:hint="eastAsia"/>
-        </w:rPr>
-        <w:t>合同采购内容、合同金额、付款计划、合同期限、生效条件、</w:t>
-      </w:r>
-      <w:r>
-        <w:rPr>
-          <w:rFonts w:hint="eastAsia"/>
-        </w:rPr>
-        <w:t>知识产权约定或产品质量保证条款、</w:t>
-      </w:r>
-      <w:r>
-        <w:rPr>
-          <w:rFonts w:hint="eastAsia"/>
-        </w:rPr>
-        <w:t>保密条款、</w:t>
-      </w:r>
-      <w:r>
-        <w:rPr>
-          <w:rFonts w:hint="eastAsia"/>
-        </w:rPr>
-        <w:t>交付条款、</w:t>
-      </w:r>
-      <w:r>
-        <w:rPr>
-          <w:rFonts w:hint="eastAsia"/>
-        </w:rPr>
-        <w:t>验收条款、完成时限、</w:t>
-      </w:r>
-      <w:r>
-        <w:rPr>
-          <w:rFonts w:hint="eastAsia"/>
-        </w:rPr>
-        <w:t>违约责任、</w:t>
-      </w:r>
-      <w:r>
-        <w:rPr>
-          <w:rFonts w:hint="eastAsia"/>
-        </w:rPr>
-        <w:t>合同解除、</w:t>
-      </w:r>
-      <w:r>
-        <w:rPr>
-          <w:rFonts w:hint="eastAsia"/>
-        </w:rPr>
-        <w:t>司法管辖、不可抗力、廉洁承诺</w:t>
-      </w:r>
-      <w:r>
-        <w:rPr>
-          <w:rFonts w:hint="eastAsia"/>
-        </w:rPr>
-        <w:t>、合同变更</w:t>
-      </w:r>
-      <w:r>
-        <w:rPr>
-          <w:rFonts w:hint="eastAsia"/>
-        </w:rPr>
-        <w:t>、合同份数、电子送达约定</w:t>
-      </w:r>
-      <w:r>
-        <w:rPr>
-          <w:rFonts w:hint="eastAsia"/>
-        </w:rPr>
-        <w:t>等是否完整</w:t>
-      </w:r>
-    </w:p>
-    <w:p>
-      <w:pPr>
-        <w:ind w:firstLineChars="100"/>
-      </w:pPr>
-      <w:r>
-        <w:rPr>
-          <w:rFonts w:hint="eastAsia"/>
-        </w:rPr>
-        <w:t>1</w:t>
-      </w:r>
-      <w:r>
-        <w:t>.</w:t>
-      </w:r>
-      <w:r>
-        <w:rPr>
-          <w:rFonts w:hint="eastAsia"/>
-        </w:rPr>
-        <w:t>合同主要项目负责人是否确定、是否预留</w:t>
-      </w:r>
-      <w:r>
-        <w:rPr>
-          <w:rFonts w:hint="eastAsia"/>
-        </w:rPr>
-        <w:t>姓名、身份证号码及电话号码</w:t>
-      </w:r>
-    </w:p>
-    <w:p>
-      <w:pPr>
-        <w:ind w:firstLineChars="100"/>
-      </w:pPr>
-      <w:r>
-        <w:rPr>
-          <w:rFonts w:hint="eastAsia"/>
-        </w:rPr>
-        <w:t>2</w:t>
-      </w:r>
-      <w:r>
-        <w:t>.</w:t>
-      </w:r>
-      <w:r>
-        <w:rPr>
-          <w:rFonts w:hint="eastAsia"/>
-        </w:rPr>
-        <w:t>采购内容：</w:t>
-      </w:r>
-      <w:r>
-        <w:rPr>
-          <w:rFonts w:hint="eastAsia"/>
-        </w:rPr>
-        <w:t>品种、规格、型号、等级、花色等应具体注明，必要时可通过附件说明标的物的实际情况。</w:t>
-      </w:r>
-    </w:p>
-    <w:p>
-      <w:pPr>
-        <w:ind w:firstLineChars="100"/>
-      </w:pPr>
-      <w:r>
-        <w:rPr>
-          <w:rFonts w:hint="eastAsia"/>
-        </w:rPr>
-        <w:t>3</w:t>
-      </w:r>
-      <w:r>
-        <w:t>.</w:t>
-      </w:r>
-      <w:r>
-        <w:rPr>
-          <w:rFonts w:hint="eastAsia"/>
-        </w:rPr>
-        <w:t>合同金额：</w:t>
-      </w:r>
-      <w:r>
-        <w:rPr>
-          <w:rFonts w:hint="eastAsia"/>
-        </w:rPr>
-        <w:t>数量、价款要明确，包括数额的计量单位，同时写明标的物的单价、总价，币种等</w:t>
-      </w:r>
-      <w:r>
-        <w:rPr>
-          <w:rFonts w:hint="eastAsia"/>
-        </w:rPr>
-        <w:t>，</w:t>
-      </w:r>
-      <w:r>
-        <w:rPr>
-          <w:highlight w:val="yellow"/>
-        </w:rPr>
-        <w:t>如合同标的可能因外部因素调整数量</w:t>
-      </w:r>
-      <w:r>
-        <w:rPr>
-          <w:highlight w:val="yellow"/>
+      </w:pPr>
+      <w:r>
+        <w:rPr>
+          <w:rFonts w:hint="eastAsia"/>
+        </w:rPr>
+        <w:t>三、其他</w:t>
+      </w:r>
+      <w:r>
+        <w:rPr>
+          <w:rFonts w:hint="eastAsia"/>
+        </w:rPr>
+        <w:t>基本问题</w:t>
+      </w:r>
+    </w:p>
+    <w:p>
+      <w:pPr>
+        <w:pStyle w:val="criteria"/>
+        <w:numPr>
+          <w:ilvl w:val="0"/>
+          <w:numId w:val="7"/>
+        </w:numPr>
+        <w:ind w:left="255" w:hanging="57"/>
+      </w:pPr>
+      <w:r>
+        <w:rPr>
+          <w:rFonts w:hint="eastAsia"/>
+        </w:rPr>
+        <w:t>是否有错别字、是否标题顺序杂乱、是否付款计划所有总和与合同总金额不一致，合同金额大小写不一致、语句语病</w:t>
+      </w:r>
+    </w:p>
+    <w:p>
+      <w:pPr>
+        <w:pStyle w:val="criteria"/>
+      </w:pPr>
+      <w:r>
+        <w:rPr>
+          <w:rFonts w:hint="eastAsia"/>
+        </w:rPr>
+        <w:t>校验相同条款在正文与附件中约定是否一致</w:t>
+      </w:r>
+    </w:p>
+    <w:p>
+      <w:pPr>
+        <w:pStyle w:val="criteria"/>
+      </w:pPr>
+      <w:r>
+        <w:rPr>
+          <w:rFonts w:hint="eastAsia"/>
+        </w:rPr>
+        <w:t>校验是否出现招标单位、谈判单位等其他流程中相关用语</w:t>
+      </w:r>
+    </w:p>
+    <w:p>
+      <w:pPr>
+        <w:pStyle w:val="criteria"/>
+      </w:pPr>
+      <w:r>
+        <w:rPr>
+          <w:rFonts w:hint="eastAsia"/>
+        </w:rPr>
+        <w:t>合同主体名称和签订主体名称首尾须保持一致</w:t>
+      </w:r>
+    </w:p>
+    <w:p>
+      <w:pPr>
+        <w:pStyle w:val="criteria"/>
+      </w:pPr>
+      <w:r>
+        <w:rPr>
+          <w:rFonts w:hint="eastAsia"/>
+        </w:rPr>
+        <w:t>正文最后，写上“以下为合同签署栏</w:t>
+      </w:r>
+      <w:r>
+        <w:rPr>
+          <w:rFonts w:hint="eastAsia"/>
         </w:rPr>
         <w:t>/</w:t>
       </w:r>
       <w:r>
         <w:rPr>
-          <w:highlight w:val="yellow"/>
-        </w:rPr>
-        <w:t>范围（如展位面积、服务量），应约定相应价款调整机制</w:t>
-      </w:r>
-      <w:r>
-        <w:rPr>
-          <w:rFonts w:hint="eastAsia"/>
-          <w:highlight w:val="yellow"/>
-        </w:rPr>
-        <w:t>。</w:t>
-      </w:r>
-    </w:p>
-    <w:p>
-      <w:pPr>
-        <w:ind w:firstLineChars="100"/>
-      </w:pPr>
-      <w:r>
-        <w:rPr>
-          <w:rFonts w:hint="eastAsia"/>
-        </w:rPr>
-        <w:t>4</w:t>
-      </w:r>
-      <w:r>
-        <w:t>.</w:t>
-      </w:r>
-      <w:r>
-        <w:rPr>
-          <w:rFonts w:hint="eastAsia"/>
-        </w:rPr>
-        <w:t>付款计划：要有明确节点确认付款，应预留一部分金额待免费维保期结束后支付，且明确发票类型</w:t>
-      </w:r>
-    </w:p>
-    <w:p>
-      <w:pPr>
-        <w:ind w:firstLineChars="100"/>
-      </w:pPr>
-      <w:r>
-        <w:rPr>
-          <w:rFonts w:hint="eastAsia"/>
-        </w:rPr>
-        <w:t>5</w:t>
-      </w:r>
-      <w:r>
-        <w:t>.</w:t>
-      </w:r>
-      <w:r>
-        <w:rPr>
-          <w:rFonts w:hint="eastAsia"/>
-        </w:rPr>
-        <w:t>合同期限：</w:t>
-      </w:r>
-      <w:r>
-        <w:rPr>
-          <w:rFonts w:hint="eastAsia"/>
-        </w:rPr>
-        <w:t>约定具体的合同履行期限，可按照年度、季度、月、旬、日计算；同时，明确各期限的概念，如自然日或工作日、自然季度或从起始日开始计算至第三个月同一日的前一天等，避免模棱两可的语言。</w:t>
-      </w:r>
-    </w:p>
-    <w:p>
-      <w:pPr>
-        <w:ind w:firstLineChars="100"/>
-      </w:pPr>
-      <w:r>
-        <w:rPr>
-          <w:rFonts w:hint="eastAsia"/>
-        </w:rPr>
-        <w:t>6</w:t>
-      </w:r>
-      <w:r>
-        <w:t>.</w:t>
-      </w:r>
-      <w:r>
-        <w:rPr>
-          <w:rFonts w:hint="eastAsia"/>
-        </w:rPr>
-        <w:t>完成时限：明确每一工作阶段应完成的工作内容，以及提交工作成果的形式。</w:t>
-      </w:r>
-    </w:p>
-    <w:p>
-      <w:pPr>
-        <w:ind w:firstLineChars="100"/>
-        <w:rPr>
-          <w:rFonts w:hint="eastAsia"/>
-        </w:rPr>
-      </w:pPr>
-      <w:r>
-        <w:t>7.</w:t>
-      </w:r>
-      <w:r>
-        <w:rPr>
-          <w:rFonts w:hint="eastAsia"/>
-        </w:rPr>
-        <w:t>违约责任：</w:t>
-      </w:r>
-      <w:r>
-        <w:rPr>
-          <w:highlight w:val="yellow"/>
-        </w:rPr>
-        <w:t>合同应针对相对方可能的各类违约情形（如变更安排、安全保障、第三方权利主张、配合履约、保密违规、数据</w:t>
-      </w:r>
-      <w:r>
-        <w:rPr>
-          <w:highlight w:val="yellow"/>
-        </w:rPr>
-        <w:t>/</w:t>
-      </w:r>
-      <w:r>
-        <w:rPr>
-          <w:highlight w:val="yellow"/>
-        </w:rPr>
-        <w:t>人员管理不当、设备故障等）逐一约定相应违约责任、赔偿范围或救济机制，并设置兜底条款覆盖未明确列举的其他违约情形；违约金比例、赔偿范围、责任上限应与合同金额、标的性质、项目重要性及可能损失相匹配。</w:t>
-      </w:r>
-    </w:p>
-    <w:p>
-      <w:pPr>
-        <w:ind w:firstLineChars="100"/>
-      </w:pPr>
-      <w:r>
-        <w:lastRenderedPageBreak/>
-        <w:t>8.</w:t>
-      </w:r>
-      <w:r>
-        <w:rPr>
-          <w:rFonts w:hint="eastAsia"/>
-        </w:rPr>
-        <w:t>司法关系：由我方住所地人民法院管辖。</w:t>
-      </w:r>
-    </w:p>
-    <w:p>
-      <w:pPr>
-        <w:ind w:firstLineChars="100"/>
-      </w:pPr>
-      <w:r>
-        <w:rPr>
-          <w:rFonts w:hint="eastAsia"/>
-          <w:highlight w:val="yellow"/>
-        </w:rPr>
-        <w:t xml:space="preserve">9. </w:t>
-      </w:r>
-      <w:r>
-        <w:rPr>
-          <w:rFonts w:hint="eastAsia"/>
-          <w:highlight w:val="yellow"/>
-        </w:rPr>
-        <w:t>合同内部条款逻辑一致性：同一事项或同一违约情形在交付、验收、付款、解除、退款、违约责任、损失赔偿等条款中的约定应前后一致，避免触发条件不一致、责任后果冲突、引用不明或衔接不完整。</w:t>
-      </w:r>
-    </w:p>
-    <w:p>
-      <w:pPr>
-        <w:ind w:firstLineChars="100"/>
-        <w:rPr>
-          <w:rFonts w:hint="eastAsia"/>
-        </w:rPr>
-      </w:pPr>
-      <w:r>
-        <w:rPr>
-          <w:rFonts w:hint="eastAsia"/>
-          <w:highlight w:val="yellow"/>
-        </w:rPr>
-        <w:t>10.</w:t>
-      </w:r>
-      <w:r>
-        <w:rPr>
-          <w:rFonts w:hint="eastAsia"/>
-        </w:rPr>
-        <w:t xml:space="preserve"> </w:t>
-      </w:r>
-      <w:r>
-        <w:rPr>
-          <w:rFonts w:hint="eastAsia"/>
-          <w:highlight w:val="yellow"/>
-        </w:rPr>
-        <w:t>金钱担保机制完整性：合同如涉及履约保证金、押金、定金、质押、质保金等金钱担保机制，应该查该机制是否覆盖完整生命周期：缴纳时点与金额、调整或补充义务、退还条件与时点、各环节未履行时的违约责任。其中任</w:t>
-      </w:r>
-      <w:proofErr w:type="gramStart"/>
-      <w:r>
-        <w:rPr>
-          <w:rFonts w:hint="eastAsia"/>
-          <w:highlight w:val="yellow"/>
-        </w:rPr>
-        <w:t>一</w:t>
-      </w:r>
-      <w:proofErr w:type="gramEnd"/>
-      <w:r>
-        <w:rPr>
-          <w:rFonts w:hint="eastAsia"/>
-          <w:highlight w:val="yellow"/>
-        </w:rPr>
-        <w:t>环节缺失应建议补充。</w:t>
-      </w:r>
-    </w:p>
-    <w:p>
-      <w:pPr>
-        <w:ind w:firstLineChars="100"/>
-      </w:pPr>
-      <w:r>
-        <w:rPr>
-          <w:rFonts w:hint="eastAsia"/>
-        </w:rPr>
-        <w:t>三、其他</w:t>
-      </w:r>
-      <w:r>
-        <w:rPr>
-          <w:rFonts w:hint="eastAsia"/>
-        </w:rPr>
-        <w:t>基本问题</w:t>
-      </w:r>
-    </w:p>
-    <w:p>
-      <w:pPr>
-        <w:ind w:firstLineChars="100"/>
-      </w:pPr>
-      <w:r>
-        <w:rPr>
-          <w:rFonts w:hint="eastAsia"/>
-        </w:rPr>
-        <w:t>1</w:t>
-      </w:r>
-      <w:r>
-        <w:t>.</w:t>
-      </w:r>
-      <w:r>
-        <w:rPr>
-          <w:rFonts w:hint="eastAsia"/>
-        </w:rPr>
-        <w:t>是否有错别字、是否标题顺序杂乱、是否付款计划所有总和与合同总金额不一致，合同金额大小写不一致、语句语病</w:t>
-      </w:r>
-    </w:p>
-    <w:p>
-      <w:pPr>
-        <w:ind w:firstLineChars="100"/>
-      </w:pPr>
-      <w:r>
-        <w:rPr>
-          <w:rFonts w:hint="eastAsia"/>
-        </w:rPr>
-        <w:t>2</w:t>
-      </w:r>
-      <w:r>
-        <w:t>.</w:t>
-      </w:r>
-      <w:r>
-        <w:rPr>
-          <w:rFonts w:hint="eastAsia"/>
-        </w:rPr>
-        <w:t>校验相同条款在正文与附件中约定是否一致</w:t>
-      </w:r>
-    </w:p>
-    <w:p>
-      <w:pPr>
-        <w:ind w:firstLineChars="100"/>
-      </w:pPr>
-      <w:r>
-        <w:rPr>
-          <w:rFonts w:hint="eastAsia"/>
-        </w:rPr>
-        <w:t>3</w:t>
-      </w:r>
-      <w:r>
-        <w:t>.</w:t>
-      </w:r>
-      <w:r>
-        <w:rPr>
-          <w:rFonts w:hint="eastAsia"/>
-        </w:rPr>
-        <w:t>校验是否出现招标单位、谈判单位等其他流程中相关用语</w:t>
-      </w:r>
-    </w:p>
-    <w:p>
-      <w:pPr>
-        <w:ind w:firstLineChars="100"/>
-      </w:pPr>
-      <w:r>
-        <w:rPr>
-          <w:rFonts w:hint="eastAsia"/>
-        </w:rPr>
-        <w:t>4</w:t>
-      </w:r>
-      <w:r>
-        <w:t>.</w:t>
-      </w:r>
-      <w:r>
-        <w:rPr>
-          <w:rFonts w:hint="eastAsia"/>
-        </w:rPr>
-        <w:t>合同主体名称和签订主体名称首尾须保持一致</w:t>
-      </w:r>
-    </w:p>
-    <w:p>
-      <w:pPr>
-        <w:ind w:firstLineChars="100"/>
-      </w:pPr>
-      <w:r>
-        <w:rPr>
-          <w:rFonts w:hint="eastAsia"/>
-        </w:rPr>
-        <w:t>5</w:t>
-      </w:r>
-      <w:r>
-        <w:t>.</w:t>
-      </w:r>
-      <w:r>
-        <w:rPr>
-          <w:rFonts w:hint="eastAsia"/>
-        </w:rPr>
-        <w:t>正文最后，写上“以下为合同签署栏</w:t>
-      </w:r>
-      <w:r>
-        <w:rPr>
-          <w:rFonts w:hint="eastAsia"/>
-        </w:rPr>
-        <w:t>/</w:t>
-      </w:r>
-      <w:r>
-        <w:rPr>
           <w:rFonts w:hint="eastAsia"/>
         </w:rPr>
         <w:t>以下无正文”的内容</w:t>
@@ -588,17 +442,8 @@
     </w:p>
     <w:p>
       <w:pPr>
-        <w:ind w:firstLineChars="100"/>
-      </w:pPr>
-      <w:r>
-        <w:rPr>
-          <w:rFonts w:hint="eastAsia"/>
-        </w:rPr>
-        <w:t>6</w:t>
-      </w:r>
-      <w:r>
-        <w:t>.</w:t>
-      </w:r>
+        <w:pStyle w:val="criteria"/>
+      </w:pPr>
       <w:r>
         <w:rPr>
           <w:rFonts w:hint="eastAsia"/>
@@ -607,12 +452,12 @@
       </w:r>
     </w:p>
     <w:sectPr>
-      <w:headerReference w:type="even" r:id="rId6"/>
-      <w:headerReference w:type="default" r:id="rId7"/>
-      <w:footerReference w:type="even" r:id="rId8"/>
-      <w:footerReference w:type="default" r:id="rId9"/>
-      <w:headerReference w:type="first" r:id="rId10"/>
-      <w:footerReference w:type="first" r:id="rId11"/>
+      <w:headerReference w:type="even" r:id="rId7"/>
+      <w:headerReference w:type="default" r:id="rId8"/>
+      <w:footerReference w:type="even" r:id="rId9"/>
+      <w:footerReference w:type="default" r:id="rId10"/>
+      <w:headerReference w:type="first" r:id="rId11"/>
+      <w:footerReference w:type="first" r:id="rId12"/>
       <w:pgSz w:w="11906" w:h="16838"/>
       <w:pgMar w:top="2098" w:right="1474" w:bottom="1985" w:left="1588" w:header="851" w:footer="992" w:gutter="0"/>
       <w:cols w:space="425"/>
@@ -653,7 +498,7 @@
 <w:ftr xmlns:wpc="http://schemas.microsoft.com/office/word/2010/wordprocessingCanvas" xmlns:cx="http://schemas.microsoft.com/office/drawing/2014/chartex" xmlns:cx1="http://schemas.microsoft.com/office/drawing/2015/9/8/chartex" xmlns:cx2="http://schemas.microsoft.com/office/drawing/2015/10/21/chartex" xmlns:cx3="http://schemas.microsoft.com/office/drawing/2016/5/9/chartex" xmlns:cx4="http://schemas.microsoft.com/office/drawing/2016/5/10/chartex" xmlns:cx5="http://schemas.microsoft.com/office/drawing/2016/5/11/chartex" xmlns:cx6="http://schemas.microsoft.com/office/drawing/2016/5/12/chartex" xmlns:cx7="http://schemas.microsoft.com/office/drawing/2016/5/13/chartex" xmlns:cx8="http://schemas.microsoft.com/office/drawing/2016/5/14/chartex" xmlns:mc="http://schemas.openxmlformats.org/markup-compatibility/2006" xmlns:aink="http://schemas.microsoft.com/office/drawing/2016/ink" xmlns:am3d="http://schemas.microsoft.com/office/drawing/2017/model3d" xmlns:o="urn:schemas-microsoft-com:office:office" xmlns:oel="http://schemas.microsoft.com/office/2019/extlst" xmlns:r="http://schemas.openxmlformats.org/officeDocument/2006/relationships" xmlns:m="http://schemas.openxmlformats.org/officeDocument/2006/math" xmlns:v="urn:schemas-microsoft-com:vml" xmlns:wp14="http://schemas.microsoft.com/office/word/2010/wordprocessingDrawing" xmlns:wp="http://schemas.openxmlformats.org/drawingml/2006/wordprocessingDrawing" xmlns:w10="urn:schemas-microsoft-com:office:word" xmlns:w="http://schemas.openxmlformats.org/wordprocessingml/2006/main" xmlns:w14="http://schemas.microsoft.com/office/word/2010/wordml" xmlns:w15="http://schemas.microsoft.com/office/word/2012/wordml" xmlns:w16cex="http://schemas.microsoft.com/office/word/2018/wordml/cex" xmlns:w16cid="http://schemas.microsoft.com/office/word/2016/wordml/cid" xmlns:w16="http://schemas.microsoft.com/office/word/2018/wordml" xmlns:w16du="http://schemas.microsoft.com/office/word/2023/wordml/word16du" xmlns:w16sdtdh="http://schemas.microsoft.com/office/word/2020/wordml/sdtdatahash" xmlns:w16sdtfl="http://schemas.microsoft.com/office/word/2024/wordml/sdtformatlock" xmlns:w16se="http://schemas.microsoft.com/office/word/2015/wordml/symex" xmlns:wpg="http://schemas.microsoft.com/office/word/2010/wordprocessingGroup" xmlns:wpi="http://schemas.microsoft.com/office/word/2010/wordprocessingInk" xmlns:wne="http://schemas.microsoft.com/office/word/2006/wordml" xmlns:wps="http://schemas.microsoft.com/office/word/2010/wordprocessingShape" mc:Ignorable="w14 w15 w16se w16cid w16 w16cex w16sdtdh w16sdtfl w16du wp14">
   <w:p>
     <w:pPr>
-      <w:pStyle w:val="Footer"/>
+      <w:pStyle w:val="a6"/>
       <w:ind w:firstLine="360"/>
     </w:pPr>
   </w:p>
@@ -664,7 +509,7 @@
 <w:ftr xmlns:wpc="http://schemas.microsoft.com/office/word/2010/wordprocessingCanvas" xmlns:cx="http://schemas.microsoft.com/office/drawing/2014/chartex" xmlns:cx1="http://schemas.microsoft.com/office/drawing/2015/9/8/chartex" xmlns:cx2="http://schemas.microsoft.com/office/drawing/2015/10/21/chartex" xmlns:cx3="http://schemas.microsoft.com/office/drawing/2016/5/9/chartex" xmlns:cx4="http://schemas.microsoft.com/office/drawing/2016/5/10/chartex" xmlns:cx5="http://schemas.microsoft.com/office/drawing/2016/5/11/chartex" xmlns:cx6="http://schemas.microsoft.com/office/drawing/2016/5/12/chartex" xmlns:cx7="http://schemas.microsoft.com/office/drawing/2016/5/13/chartex" xmlns:cx8="http://schemas.microsoft.com/office/drawing/2016/5/14/chartex" xmlns:mc="http://schemas.openxmlformats.org/markup-compatibility/2006" xmlns:aink="http://schemas.microsoft.com/office/drawing/2016/ink" xmlns:am3d="http://schemas.microsoft.com/office/drawing/2017/model3d" xmlns:o="urn:schemas-microsoft-com:office:office" xmlns:oel="http://schemas.microsoft.com/office/2019/extlst" xmlns:r="http://schemas.openxmlformats.org/officeDocument/2006/relationships" xmlns:m="http://schemas.openxmlformats.org/officeDocument/2006/math" xmlns:v="urn:schemas-microsoft-com:vml" xmlns:wp14="http://schemas.microsoft.com/office/word/2010/wordprocessingDrawing" xmlns:wp="http://schemas.openxmlformats.org/drawingml/2006/wordprocessingDrawing" xmlns:w10="urn:schemas-microsoft-com:office:word" xmlns:w="http://schemas.openxmlformats.org/wordprocessingml/2006/main" xmlns:w14="http://schemas.microsoft.com/office/word/2010/wordml" xmlns:w15="http://schemas.microsoft.com/office/word/2012/wordml" xmlns:w16cex="http://schemas.microsoft.com/office/word/2018/wordml/cex" xmlns:w16cid="http://schemas.microsoft.com/office/word/2016/wordml/cid" xmlns:w16="http://schemas.microsoft.com/office/word/2018/wordml" xmlns:w16du="http://schemas.microsoft.com/office/word/2023/wordml/word16du" xmlns:w16sdtdh="http://schemas.microsoft.com/office/word/2020/wordml/sdtdatahash" xmlns:w16sdtfl="http://schemas.microsoft.com/office/word/2024/wordml/sdtformatlock" xmlns:w16se="http://schemas.microsoft.com/office/word/2015/wordml/symex" xmlns:wpg="http://schemas.microsoft.com/office/word/2010/wordprocessingGroup" xmlns:wpi="http://schemas.microsoft.com/office/word/2010/wordprocessingInk" xmlns:wne="http://schemas.microsoft.com/office/word/2006/wordml" xmlns:wps="http://schemas.microsoft.com/office/word/2010/wordprocessingShape" mc:Ignorable="w14 w15 w16se w16cid w16 w16cex w16sdtdh w16sdtfl w16du wp14">
   <w:p>
     <w:pPr>
-      <w:pStyle w:val="Footer"/>
+      <w:pStyle w:val="a6"/>
       <w:ind w:firstLine="360"/>
     </w:pPr>
   </w:p>
@@ -675,7 +520,7 @@
 <w:ftr xmlns:wpc="http://schemas.microsoft.com/office/word/2010/wordprocessingCanvas" xmlns:cx="http://schemas.microsoft.com/office/drawing/2014/chartex" xmlns:cx1="http://schemas.microsoft.com/office/drawing/2015/9/8/chartex" xmlns:cx2="http://schemas.microsoft.com/office/drawing/2015/10/21/chartex" xmlns:cx3="http://schemas.microsoft.com/office/drawing/2016/5/9/chartex" xmlns:cx4="http://schemas.microsoft.com/office/drawing/2016/5/10/chartex" xmlns:cx5="http://schemas.microsoft.com/office/drawing/2016/5/11/chartex" xmlns:cx6="http://schemas.microsoft.com/office/drawing/2016/5/12/chartex" xmlns:cx7="http://schemas.microsoft.com/office/drawing/2016/5/13/chartex" xmlns:cx8="http://schemas.microsoft.com/office/drawing/2016/5/14/chartex" xmlns:mc="http://schemas.openxmlformats.org/markup-compatibility/2006" xmlns:aink="http://schemas.microsoft.com/office/drawing/2016/ink" xmlns:am3d="http://schemas.microsoft.com/office/drawing/2017/model3d" xmlns:o="urn:schemas-microsoft-com:office:office" xmlns:oel="http://schemas.microsoft.com/office/2019/extlst" xmlns:r="http://schemas.openxmlformats.org/officeDocument/2006/relationships" xmlns:m="http://schemas.openxmlformats.org/officeDocument/2006/math" xmlns:v="urn:schemas-microsoft-com:vml" xmlns:wp14="http://schemas.microsoft.com/office/word/2010/wordprocessingDrawing" xmlns:wp="http://schemas.openxmlformats.org/drawingml/2006/wordprocessingDrawing" xmlns:w10="urn:schemas-microsoft-com:office:word" xmlns:w="http://schemas.openxmlformats.org/wordprocessingml/2006/main" xmlns:w14="http://schemas.microsoft.com/office/word/2010/wordml" xmlns:w15="http://schemas.microsoft.com/office/word/2012/wordml" xmlns:w16cex="http://schemas.microsoft.com/office/word/2018/wordml/cex" xmlns:w16cid="http://schemas.microsoft.com/office/word/2016/wordml/cid" xmlns:w16="http://schemas.microsoft.com/office/word/2018/wordml" xmlns:w16du="http://schemas.microsoft.com/office/word/2023/wordml/word16du" xmlns:w16sdtdh="http://schemas.microsoft.com/office/word/2020/wordml/sdtdatahash" xmlns:w16sdtfl="http://schemas.microsoft.com/office/word/2024/wordml/sdtformatlock" xmlns:w16se="http://schemas.microsoft.com/office/word/2015/wordml/symex" xmlns:wpg="http://schemas.microsoft.com/office/word/2010/wordprocessingGroup" xmlns:wpi="http://schemas.microsoft.com/office/word/2010/wordprocessingInk" xmlns:wne="http://schemas.microsoft.com/office/word/2006/wordml" xmlns:wps="http://schemas.microsoft.com/office/word/2010/wordprocessingShape" mc:Ignorable="w14 w15 w16se w16cid w16 w16cex w16sdtdh w16sdtfl w16du wp14">
   <w:p>
     <w:pPr>
-      <w:pStyle w:val="Footer"/>
+      <w:pStyle w:val="a6"/>
       <w:ind w:firstLine="360"/>
     </w:pPr>
   </w:p>
@@ -713,7 +558,7 @@
 <w:hdr xmlns:wpc="http://schemas.microsoft.com/office/word/2010/wordprocessingCanvas" xmlns:cx="http://schemas.microsoft.com/office/drawing/2014/chartex" xmlns:cx1="http://schemas.microsoft.com/office/drawing/2015/9/8/chartex" xmlns:cx2="http://schemas.microsoft.com/office/drawing/2015/10/21/chartex" xmlns:cx3="http://schemas.microsoft.com/office/drawing/2016/5/9/chartex" xmlns:cx4="http://schemas.microsoft.com/office/drawing/2016/5/10/chartex" xmlns:cx5="http://schemas.microsoft.com/office/drawing/2016/5/11/chartex" xmlns:cx6="http://schemas.microsoft.com/office/drawing/2016/5/12/chartex" xmlns:cx7="http://schemas.microsoft.com/office/drawing/2016/5/13/chartex" xmlns:cx8="http://schemas.microsoft.com/office/drawing/2016/5/14/chartex" xmlns:mc="http://schemas.openxmlformats.org/markup-compatibility/2006" xmlns:aink="http://schemas.microsoft.com/office/drawing/2016/ink" xmlns:am3d="http://schemas.microsoft.com/office/drawing/2017/model3d" xmlns:o="urn:schemas-microsoft-com:office:office" xmlns:oel="http://schemas.microsoft.com/office/2019/extlst" xmlns:r="http://schemas.openxmlformats.org/officeDocument/2006/relationships" xmlns:m="http://schemas.openxmlformats.org/officeDocument/2006/math" xmlns:v="urn:schemas-microsoft-com:vml" xmlns:wp14="http://schemas.microsoft.com/office/word/2010/wordprocessingDrawing" xmlns:wp="http://schemas.openxmlformats.org/drawingml/2006/wordprocessingDrawing" xmlns:w10="urn:schemas-microsoft-com:office:word" xmlns:w="http://schemas.openxmlformats.org/wordprocessingml/2006/main" xmlns:w14="http://schemas.microsoft.com/office/word/2010/wordml" xmlns:w15="http://schemas.microsoft.com/office/word/2012/wordml" xmlns:w16cex="http://schemas.microsoft.com/office/word/2018/wordml/cex" xmlns:w16cid="http://schemas.microsoft.com/office/word/2016/wordml/cid" xmlns:w16="http://schemas.microsoft.com/office/word/2018/wordml" xmlns:w16du="http://schemas.microsoft.com/office/word/2023/wordml/word16du" xmlns:w16sdtdh="http://schemas.microsoft.com/office/word/2020/wordml/sdtdatahash" xmlns:w16sdtfl="http://schemas.microsoft.com/office/word/2024/wordml/sdtformatlock" xmlns:w16se="http://schemas.microsoft.com/office/word/2015/wordml/symex" xmlns:wpg="http://schemas.microsoft.com/office/word/2010/wordprocessingGroup" xmlns:wpi="http://schemas.microsoft.com/office/word/2010/wordprocessingInk" xmlns:wne="http://schemas.microsoft.com/office/word/2006/wordml" xmlns:wps="http://schemas.microsoft.com/office/word/2010/wordprocessingShape" mc:Ignorable="w14 w15 w16se w16cid w16 w16cex w16sdtdh w16sdtfl w16du wp14">
   <w:p>
     <w:pPr>
-      <w:pStyle w:val="Header"/>
+      <w:pStyle w:val="a4"/>
       <w:ind w:firstLine="360"/>
     </w:pPr>
   </w:p>
@@ -724,7 +569,7 @@
 <w:hdr xmlns:wpc="http://schemas.microsoft.com/office/word/2010/wordprocessingCanvas" xmlns:cx="http://schemas.microsoft.com/office/drawing/2014/chartex" xmlns:cx1="http://schemas.microsoft.com/office/drawing/2015/9/8/chartex" xmlns:cx2="http://schemas.microsoft.com/office/drawing/2015/10/21/chartex" xmlns:cx3="http://schemas.microsoft.com/office/drawing/2016/5/9/chartex" xmlns:cx4="http://schemas.microsoft.com/office/drawing/2016/5/10/chartex" xmlns:cx5="http://schemas.microsoft.com/office/drawing/2016/5/11/chartex" xmlns:cx6="http://schemas.microsoft.com/office/drawing/2016/5/12/chartex" xmlns:cx7="http://schemas.microsoft.com/office/drawing/2016/5/13/chartex" xmlns:cx8="http://schemas.microsoft.com/office/drawing/2016/5/14/chartex" xmlns:mc="http://schemas.openxmlformats.org/markup-compatibility/2006" xmlns:aink="http://schemas.microsoft.com/office/drawing/2016/ink" xmlns:am3d="http://schemas.microsoft.com/office/drawing/2017/model3d" xmlns:o="urn:schemas-microsoft-com:office:office" xmlns:oel="http://schemas.microsoft.com/office/2019/extlst" xmlns:r="http://schemas.openxmlformats.org/officeDocument/2006/relationships" xmlns:m="http://schemas.openxmlformats.org/officeDocument/2006/math" xmlns:v="urn:schemas-microsoft-com:vml" xmlns:wp14="http://schemas.microsoft.com/office/word/2010/wordprocessingDrawing" xmlns:wp="http://schemas.openxmlformats.org/drawingml/2006/wordprocessingDrawing" xmlns:w10="urn:schemas-microsoft-com:office:word" xmlns:w="http://schemas.openxmlformats.org/wordprocessingml/2006/main" xmlns:w14="http://schemas.microsoft.com/office/word/2010/wordml" xmlns:w15="http://schemas.microsoft.com/office/word/2012/wordml" xmlns:w16cex="http://schemas.microsoft.com/office/word/2018/wordml/cex" xmlns:w16cid="http://schemas.microsoft.com/office/word/2016/wordml/cid" xmlns:w16="http://schemas.microsoft.com/office/word/2018/wordml" xmlns:w16du="http://schemas.microsoft.com/office/word/2023/wordml/word16du" xmlns:w16sdtdh="http://schemas.microsoft.com/office/word/2020/wordml/sdtdatahash" xmlns:w16sdtfl="http://schemas.microsoft.com/office/word/2024/wordml/sdtformatlock" xmlns:w16se="http://schemas.microsoft.com/office/word/2015/wordml/symex" xmlns:wpg="http://schemas.microsoft.com/office/word/2010/wordprocessingGroup" xmlns:wpi="http://schemas.microsoft.com/office/word/2010/wordprocessingInk" xmlns:wne="http://schemas.microsoft.com/office/word/2006/wordml" xmlns:wps="http://schemas.microsoft.com/office/word/2010/wordprocessingShape" mc:Ignorable="w14 w15 w16se w16cid w16 w16cex w16sdtdh w16sdtfl w16du wp14">
   <w:p>
     <w:pPr>
-      <w:pStyle w:val="Header"/>
+      <w:pStyle w:val="a4"/>
       <w:ind w:firstLine="360"/>
     </w:pPr>
   </w:p>
@@ -735,11 +580,489 @@
 <w:hdr xmlns:wpc="http://schemas.microsoft.com/office/word/2010/wordprocessingCanvas" xmlns:cx="http://schemas.microsoft.com/office/drawing/2014/chartex" xmlns:cx1="http://schemas.microsoft.com/office/drawing/2015/9/8/chartex" xmlns:cx2="http://schemas.microsoft.com/office/drawing/2015/10/21/chartex" xmlns:cx3="http://schemas.microsoft.com/office/drawing/2016/5/9/chartex" xmlns:cx4="http://schemas.microsoft.com/office/drawing/2016/5/10/chartex" xmlns:cx5="http://schemas.microsoft.com/office/drawing/2016/5/11/chartex" xmlns:cx6="http://schemas.microsoft.com/office/drawing/2016/5/12/chartex" xmlns:cx7="http://schemas.microsoft.com/office/drawing/2016/5/13/chartex" xmlns:cx8="http://schemas.microsoft.com/office/drawing/2016/5/14/chartex" xmlns:mc="http://schemas.openxmlformats.org/markup-compatibility/2006" xmlns:aink="http://schemas.microsoft.com/office/drawing/2016/ink" xmlns:am3d="http://schemas.microsoft.com/office/drawing/2017/model3d" xmlns:o="urn:schemas-microsoft-com:office:office" xmlns:oel="http://schemas.microsoft.com/office/2019/extlst" xmlns:r="http://schemas.openxmlformats.org/officeDocument/2006/relationships" xmlns:m="http://schemas.openxmlformats.org/officeDocument/2006/math" xmlns:v="urn:schemas-microsoft-com:vml" xmlns:wp14="http://schemas.microsoft.com/office/word/2010/wordprocessingDrawing" xmlns:wp="http://schemas.openxmlformats.org/drawingml/2006/wordprocessingDrawing" xmlns:w10="urn:schemas-microsoft-com:office:word" xmlns:w="http://schemas.openxmlformats.org/wordprocessingml/2006/main" xmlns:w14="http://schemas.microsoft.com/office/word/2010/wordml" xmlns:w15="http://schemas.microsoft.com/office/word/2012/wordml" xmlns:w16cex="http://schemas.microsoft.com/office/word/2018/wordml/cex" xmlns:w16cid="http://schemas.microsoft.com/office/word/2016/wordml/cid" xmlns:w16="http://schemas.microsoft.com/office/word/2018/wordml" xmlns:w16du="http://schemas.microsoft.com/office/word/2023/wordml/word16du" xmlns:w16sdtdh="http://schemas.microsoft.com/office/word/2020/wordml/sdtdatahash" xmlns:w16sdtfl="http://schemas.microsoft.com/office/word/2024/wordml/sdtformatlock" xmlns:w16se="http://schemas.microsoft.com/office/word/2015/wordml/symex" xmlns:wpg="http://schemas.microsoft.com/office/word/2010/wordprocessingGroup" xmlns:wpi="http://schemas.microsoft.com/office/word/2010/wordprocessingInk" xmlns:wne="http://schemas.microsoft.com/office/word/2006/wordml" xmlns:wps="http://schemas.microsoft.com/office/word/2010/wordprocessingShape" mc:Ignorable="w14 w15 w16se w16cid w16 w16cex w16sdtdh w16sdtfl w16du wp14">
   <w:p>
     <w:pPr>
-      <w:pStyle w:val="Header"/>
+      <w:pStyle w:val="a4"/>
       <w:ind w:firstLine="360"/>
     </w:pPr>
   </w:p>
 </w:hdr>
+</file>
+
+<file path=word/numbering.xml><?xml version="1.0" encoding="utf-8"?>
+<w:numbering xmlns:wpc="http://schemas.microsoft.com/office/word/2010/wordprocessingCanvas" xmlns:cx="http://schemas.microsoft.com/office/drawing/2014/chartex" xmlns:cx1="http://schemas.microsoft.com/office/drawing/2015/9/8/chartex" xmlns:cx2="http://schemas.microsoft.com/office/drawing/2015/10/21/chartex" xmlns:cx3="http://schemas.microsoft.com/office/drawing/2016/5/9/chartex" xmlns:cx4="http://schemas.microsoft.com/office/drawing/2016/5/10/chartex" xmlns:cx5="http://schemas.microsoft.com/office/drawing/2016/5/11/chartex" xmlns:cx6="http://schemas.microsoft.com/office/drawing/2016/5/12/chartex" xmlns:cx7="http://schemas.microsoft.com/office/drawing/2016/5/13/chartex" xmlns:cx8="http://schemas.microsoft.com/office/drawing/2016/5/14/chartex" xmlns:mc="http://schemas.openxmlformats.org/markup-compatibility/2006" xmlns:aink="http://schemas.microsoft.com/office/drawing/2016/ink" xmlns:am3d="http://schemas.microsoft.com/office/drawing/2017/model3d" xmlns:o="urn:schemas-microsoft-com:office:office" xmlns:oel="http://schemas.microsoft.com/office/2019/extlst" xmlns:r="http://schemas.openxmlformats.org/officeDocument/2006/relationships" xmlns:m="http://schemas.openxmlformats.org/officeDocument/2006/math" xmlns:v="urn:schemas-microsoft-com:vml" xmlns:wp14="http://schemas.microsoft.com/office/word/2010/wordprocessingDrawing" xmlns:wp="http://schemas.openxmlformats.org/drawingml/2006/wordprocessingDrawing" xmlns:w10="urn:schemas-microsoft-com:office:word" xmlns:w="http://schemas.openxmlformats.org/wordprocessingml/2006/main" xmlns:w14="http://schemas.microsoft.com/office/word/2010/wordml" xmlns:w15="http://schemas.microsoft.com/office/word/2012/wordml" xmlns:w16cex="http://schemas.microsoft.com/office/word/2018/wordml/cex" xmlns:w16cid="http://schemas.microsoft.com/office/word/2016/wordml/cid" xmlns:w16="http://schemas.microsoft.com/office/word/2018/wordml" xmlns:w16du="http://schemas.microsoft.com/office/word/2023/wordml/word16du" xmlns:w16sdtdh="http://schemas.microsoft.com/office/word/2020/wordml/sdtdatahash" xmlns:w16sdtfl="http://schemas.microsoft.com/office/word/2024/wordml/sdtformatlock" xmlns:w16se="http://schemas.microsoft.com/office/word/2015/wordml/symex" xmlns:wpg="http://schemas.microsoft.com/office/word/2010/wordprocessingGroup" xmlns:wpi="http://schemas.microsoft.com/office/word/2010/wordprocessingInk" xmlns:wne="http://schemas.microsoft.com/office/word/2006/wordml" xmlns:wps="http://schemas.microsoft.com/office/word/2010/wordprocessingShape" mc:Ignorable="w14 w15 w16se w16cid w16 w16cex w16sdtdh w16sdtfl w16du wp14">
+  <w:abstractNum w:abstractNumId="0" w15:restartNumberingAfterBreak="0">
+    <w:nsid w:val="0DAB0792"/>
+    <w:multiLevelType w:val="hybridMultilevel"/>
+    <w:tmpl w:val="08866C66"/>
+    <w:lvl w:ilvl="0" w:tplc="1898E9C0">
+      <w:start w:val="1"/>
+      <w:numFmt w:val="decimal"/>
+      <w:lvlText w:val="%1."/>
+      <w:lvlJc w:val="left"/>
+      <w:pPr>
+        <w:ind w:left="560" w:hanging="360"/>
+      </w:pPr>
+      <w:rPr>
+        <w:rFonts w:hint="default"/>
+      </w:rPr>
+    </w:lvl>
+    <w:lvl w:ilvl="1" w:tplc="04090019" w:tentative="1">
+      <w:start w:val="1"/>
+      <w:numFmt w:val="lowerLetter"/>
+      <w:lvlText w:val="%2)"/>
+      <w:lvlJc w:val="left"/>
+      <w:pPr>
+        <w:ind w:left="1080" w:hanging="440"/>
+      </w:pPr>
+    </w:lvl>
+    <w:lvl w:ilvl="2" w:tplc="0409001B" w:tentative="1">
+      <w:start w:val="1"/>
+      <w:numFmt w:val="lowerRoman"/>
+      <w:lvlText w:val="%3."/>
+      <w:lvlJc w:val="right"/>
+      <w:pPr>
+        <w:ind w:left="1520" w:hanging="440"/>
+      </w:pPr>
+    </w:lvl>
+    <w:lvl w:ilvl="3" w:tplc="0409000F" w:tentative="1">
+      <w:start w:val="1"/>
+      <w:numFmt w:val="decimal"/>
+      <w:lvlText w:val="%4."/>
+      <w:lvlJc w:val="left"/>
+      <w:pPr>
+        <w:ind w:left="1960" w:hanging="440"/>
+      </w:pPr>
+    </w:lvl>
+    <w:lvl w:ilvl="4" w:tplc="04090019" w:tentative="1">
+      <w:start w:val="1"/>
+      <w:numFmt w:val="lowerLetter"/>
+      <w:lvlText w:val="%5)"/>
+      <w:lvlJc w:val="left"/>
+      <w:pPr>
+        <w:ind w:left="2400" w:hanging="440"/>
+      </w:pPr>
+    </w:lvl>
+    <w:lvl w:ilvl="5" w:tplc="0409001B" w:tentative="1">
+      <w:start w:val="1"/>
+      <w:numFmt w:val="lowerRoman"/>
+      <w:lvlText w:val="%6."/>
+      <w:lvlJc w:val="right"/>
+      <w:pPr>
+        <w:ind w:left="2840" w:hanging="440"/>
+      </w:pPr>
+    </w:lvl>
+    <w:lvl w:ilvl="6" w:tplc="0409000F" w:tentative="1">
+      <w:start w:val="1"/>
+      <w:numFmt w:val="decimal"/>
+      <w:lvlText w:val="%7."/>
+      <w:lvlJc w:val="left"/>
+      <w:pPr>
+        <w:ind w:left="3280" w:hanging="440"/>
+      </w:pPr>
+    </w:lvl>
+    <w:lvl w:ilvl="7" w:tplc="04090019" w:tentative="1">
+      <w:start w:val="1"/>
+      <w:numFmt w:val="lowerLetter"/>
+      <w:lvlText w:val="%8)"/>
+      <w:lvlJc w:val="left"/>
+      <w:pPr>
+        <w:ind w:left="3720" w:hanging="440"/>
+      </w:pPr>
+    </w:lvl>
+    <w:lvl w:ilvl="8" w:tplc="0409001B" w:tentative="1">
+      <w:start w:val="1"/>
+      <w:numFmt w:val="lowerRoman"/>
+      <w:lvlText w:val="%9."/>
+      <w:lvlJc w:val="right"/>
+      <w:pPr>
+        <w:ind w:left="4160" w:hanging="440"/>
+      </w:pPr>
+    </w:lvl>
+  </w:abstractNum>
+  <w:abstractNum w:abstractNumId="1" w15:restartNumberingAfterBreak="0">
+    <w:nsid w:val="273F4B94"/>
+    <w:multiLevelType w:val="hybridMultilevel"/>
+    <w:tmpl w:val="4662B4BA"/>
+    <w:lvl w:ilvl="0" w:tplc="81726F1E">
+      <w:start w:val="1"/>
+      <w:numFmt w:val="japaneseCounting"/>
+      <w:lvlText w:val="%1、"/>
+      <w:lvlJc w:val="left"/>
+      <w:pPr>
+        <w:ind w:left="605" w:hanging="405"/>
+      </w:pPr>
+      <w:rPr>
+        <w:rFonts w:hint="default"/>
+      </w:rPr>
+    </w:lvl>
+    <w:lvl w:ilvl="1" w:tplc="04090019" w:tentative="1">
+      <w:start w:val="1"/>
+      <w:numFmt w:val="lowerLetter"/>
+      <w:lvlText w:val="%2)"/>
+      <w:lvlJc w:val="left"/>
+      <w:pPr>
+        <w:ind w:left="1080" w:hanging="440"/>
+      </w:pPr>
+    </w:lvl>
+    <w:lvl w:ilvl="2" w:tplc="0409001B" w:tentative="1">
+      <w:start w:val="1"/>
+      <w:numFmt w:val="lowerRoman"/>
+      <w:lvlText w:val="%3."/>
+      <w:lvlJc w:val="right"/>
+      <w:pPr>
+        <w:ind w:left="1520" w:hanging="440"/>
+      </w:pPr>
+    </w:lvl>
+    <w:lvl w:ilvl="3" w:tplc="0409000F" w:tentative="1">
+      <w:start w:val="1"/>
+      <w:numFmt w:val="decimal"/>
+      <w:lvlText w:val="%4."/>
+      <w:lvlJc w:val="left"/>
+      <w:pPr>
+        <w:ind w:left="1960" w:hanging="440"/>
+      </w:pPr>
+    </w:lvl>
+    <w:lvl w:ilvl="4" w:tplc="04090019" w:tentative="1">
+      <w:start w:val="1"/>
+      <w:numFmt w:val="lowerLetter"/>
+      <w:lvlText w:val="%5)"/>
+      <w:lvlJc w:val="left"/>
+      <w:pPr>
+        <w:ind w:left="2400" w:hanging="440"/>
+      </w:pPr>
+    </w:lvl>
+    <w:lvl w:ilvl="5" w:tplc="0409001B" w:tentative="1">
+      <w:start w:val="1"/>
+      <w:numFmt w:val="lowerRoman"/>
+      <w:lvlText w:val="%6."/>
+      <w:lvlJc w:val="right"/>
+      <w:pPr>
+        <w:ind w:left="2840" w:hanging="440"/>
+      </w:pPr>
+    </w:lvl>
+    <w:lvl w:ilvl="6" w:tplc="0409000F" w:tentative="1">
+      <w:start w:val="1"/>
+      <w:numFmt w:val="decimal"/>
+      <w:lvlText w:val="%7."/>
+      <w:lvlJc w:val="left"/>
+      <w:pPr>
+        <w:ind w:left="3280" w:hanging="440"/>
+      </w:pPr>
+    </w:lvl>
+    <w:lvl w:ilvl="7" w:tplc="04090019" w:tentative="1">
+      <w:start w:val="1"/>
+      <w:numFmt w:val="lowerLetter"/>
+      <w:lvlText w:val="%8)"/>
+      <w:lvlJc w:val="left"/>
+      <w:pPr>
+        <w:ind w:left="3720" w:hanging="440"/>
+      </w:pPr>
+    </w:lvl>
+    <w:lvl w:ilvl="8" w:tplc="0409001B" w:tentative="1">
+      <w:start w:val="1"/>
+      <w:numFmt w:val="lowerRoman"/>
+      <w:lvlText w:val="%9."/>
+      <w:lvlJc w:val="right"/>
+      <w:pPr>
+        <w:ind w:left="4160" w:hanging="440"/>
+      </w:pPr>
+    </w:lvl>
+  </w:abstractNum>
+  <w:abstractNum w:abstractNumId="2" w15:restartNumberingAfterBreak="0">
+    <w:nsid w:val="6F2B087F"/>
+    <w:multiLevelType w:val="hybridMultilevel"/>
+    <w:tmpl w:val="F5402D82"/>
+    <w:lvl w:ilvl="0" w:tplc="4A0E75BA">
+      <w:start w:val="1"/>
+      <w:numFmt w:val="decimal"/>
+      <w:pStyle w:val="criteria"/>
+      <w:lvlText w:val="%1."/>
+      <w:lvlJc w:val="left"/>
+      <w:pPr>
+        <w:ind w:left="638" w:hanging="440"/>
+      </w:pPr>
+      <w:rPr>
+        <w:rFonts w:hint="eastAsia"/>
+      </w:rPr>
+    </w:lvl>
+    <w:lvl w:ilvl="1" w:tplc="04090019" w:tentative="1">
+      <w:start w:val="1"/>
+      <w:numFmt w:val="lowerLetter"/>
+      <w:lvlText w:val="%2)"/>
+      <w:lvlJc w:val="left"/>
+      <w:pPr>
+        <w:ind w:left="1080" w:hanging="440"/>
+      </w:pPr>
+    </w:lvl>
+    <w:lvl w:ilvl="2" w:tplc="0409001B" w:tentative="1">
+      <w:start w:val="1"/>
+      <w:numFmt w:val="lowerRoman"/>
+      <w:lvlText w:val="%3."/>
+      <w:lvlJc w:val="right"/>
+      <w:pPr>
+        <w:ind w:left="1520" w:hanging="440"/>
+      </w:pPr>
+    </w:lvl>
+    <w:lvl w:ilvl="3" w:tplc="0409000F" w:tentative="1">
+      <w:start w:val="1"/>
+      <w:numFmt w:val="decimal"/>
+      <w:lvlText w:val="%4."/>
+      <w:lvlJc w:val="left"/>
+      <w:pPr>
+        <w:ind w:left="1960" w:hanging="440"/>
+      </w:pPr>
+    </w:lvl>
+    <w:lvl w:ilvl="4" w:tplc="04090019" w:tentative="1">
+      <w:start w:val="1"/>
+      <w:numFmt w:val="lowerLetter"/>
+      <w:lvlText w:val="%5)"/>
+      <w:lvlJc w:val="left"/>
+      <w:pPr>
+        <w:ind w:left="2400" w:hanging="440"/>
+      </w:pPr>
+    </w:lvl>
+    <w:lvl w:ilvl="5" w:tplc="0409001B" w:tentative="1">
+      <w:start w:val="1"/>
+      <w:numFmt w:val="lowerRoman"/>
+      <w:lvlText w:val="%6."/>
+      <w:lvlJc w:val="right"/>
+      <w:pPr>
+        <w:ind w:left="2840" w:hanging="440"/>
+      </w:pPr>
+    </w:lvl>
+    <w:lvl w:ilvl="6" w:tplc="0409000F" w:tentative="1">
+      <w:start w:val="1"/>
+      <w:numFmt w:val="decimal"/>
+      <w:lvlText w:val="%7."/>
+      <w:lvlJc w:val="left"/>
+      <w:pPr>
+        <w:ind w:left="3280" w:hanging="440"/>
+      </w:pPr>
+    </w:lvl>
+    <w:lvl w:ilvl="7" w:tplc="04090019" w:tentative="1">
+      <w:start w:val="1"/>
+      <w:numFmt w:val="lowerLetter"/>
+      <w:lvlText w:val="%8)"/>
+      <w:lvlJc w:val="left"/>
+      <w:pPr>
+        <w:ind w:left="3720" w:hanging="440"/>
+      </w:pPr>
+    </w:lvl>
+    <w:lvl w:ilvl="8" w:tplc="0409001B" w:tentative="1">
+      <w:start w:val="1"/>
+      <w:numFmt w:val="lowerRoman"/>
+      <w:lvlText w:val="%9."/>
+      <w:lvlJc w:val="right"/>
+      <w:pPr>
+        <w:ind w:left="4160" w:hanging="440"/>
+      </w:pPr>
+    </w:lvl>
+  </w:abstractNum>
+  <w:abstractNum w:abstractNumId="3" w15:restartNumberingAfterBreak="0">
+    <w:nsid w:val="744E281D"/>
+    <w:multiLevelType w:val="hybridMultilevel"/>
+    <w:tmpl w:val="393E8040"/>
+    <w:lvl w:ilvl="0" w:tplc="F6FA5948">
+      <w:start w:val="1"/>
+      <w:numFmt w:val="decimal"/>
+      <w:lvlText w:val="%1."/>
+      <w:lvlJc w:val="left"/>
+      <w:pPr>
+        <w:ind w:left="640" w:hanging="440"/>
+      </w:pPr>
+      <w:rPr>
+        <w:rFonts w:hint="eastAsia"/>
+      </w:rPr>
+    </w:lvl>
+    <w:lvl w:ilvl="1" w:tplc="04090019" w:tentative="1">
+      <w:start w:val="1"/>
+      <w:numFmt w:val="lowerLetter"/>
+      <w:lvlText w:val="%2)"/>
+      <w:lvlJc w:val="left"/>
+      <w:pPr>
+        <w:ind w:left="880" w:hanging="440"/>
+      </w:pPr>
+    </w:lvl>
+    <w:lvl w:ilvl="2" w:tplc="0409001B" w:tentative="1">
+      <w:start w:val="1"/>
+      <w:numFmt w:val="lowerRoman"/>
+      <w:lvlText w:val="%3."/>
+      <w:lvlJc w:val="right"/>
+      <w:pPr>
+        <w:ind w:left="1320" w:hanging="440"/>
+      </w:pPr>
+    </w:lvl>
+    <w:lvl w:ilvl="3" w:tplc="0409000F" w:tentative="1">
+      <w:start w:val="1"/>
+      <w:numFmt w:val="decimal"/>
+      <w:lvlText w:val="%4."/>
+      <w:lvlJc w:val="left"/>
+      <w:pPr>
+        <w:ind w:left="1760" w:hanging="440"/>
+      </w:pPr>
+    </w:lvl>
+    <w:lvl w:ilvl="4" w:tplc="04090019" w:tentative="1">
+      <w:start w:val="1"/>
+      <w:numFmt w:val="lowerLetter"/>
+      <w:lvlText w:val="%5)"/>
+      <w:lvlJc w:val="left"/>
+      <w:pPr>
+        <w:ind w:left="2200" w:hanging="440"/>
+      </w:pPr>
+    </w:lvl>
+    <w:lvl w:ilvl="5" w:tplc="0409001B" w:tentative="1">
+      <w:start w:val="1"/>
+      <w:numFmt w:val="lowerRoman"/>
+      <w:lvlText w:val="%6."/>
+      <w:lvlJc w:val="right"/>
+      <w:pPr>
+        <w:ind w:left="2640" w:hanging="440"/>
+      </w:pPr>
+    </w:lvl>
+    <w:lvl w:ilvl="6" w:tplc="0409000F" w:tentative="1">
+      <w:start w:val="1"/>
+      <w:numFmt w:val="decimal"/>
+      <w:lvlText w:val="%7."/>
+      <w:lvlJc w:val="left"/>
+      <w:pPr>
+        <w:ind w:left="3080" w:hanging="440"/>
+      </w:pPr>
+    </w:lvl>
+    <w:lvl w:ilvl="7" w:tplc="04090019" w:tentative="1">
+      <w:start w:val="1"/>
+      <w:numFmt w:val="lowerLetter"/>
+      <w:lvlText w:val="%8)"/>
+      <w:lvlJc w:val="left"/>
+      <w:pPr>
+        <w:ind w:left="3520" w:hanging="440"/>
+      </w:pPr>
+    </w:lvl>
+    <w:lvl w:ilvl="8" w:tplc="0409001B" w:tentative="1">
+      <w:start w:val="1"/>
+      <w:numFmt w:val="lowerRoman"/>
+      <w:lvlText w:val="%9."/>
+      <w:lvlJc w:val="right"/>
+      <w:pPr>
+        <w:ind w:left="3960" w:hanging="440"/>
+      </w:pPr>
+    </w:lvl>
+  </w:abstractNum>
+  <w:abstractNum w:abstractNumId="4" w15:restartNumberingAfterBreak="0">
+    <w:nsid w:val="7AB964D1"/>
+    <w:multiLevelType w:val="hybridMultilevel"/>
+    <w:tmpl w:val="073602F2"/>
+    <w:lvl w:ilvl="0" w:tplc="F6FA5948">
+      <w:start w:val="1"/>
+      <w:numFmt w:val="decimal"/>
+      <w:lvlText w:val="%1."/>
+      <w:lvlJc w:val="left"/>
+      <w:pPr>
+        <w:ind w:left="640" w:hanging="440"/>
+      </w:pPr>
+      <w:rPr>
+        <w:rFonts w:hint="eastAsia"/>
+      </w:rPr>
+    </w:lvl>
+    <w:lvl w:ilvl="1" w:tplc="04090019" w:tentative="1">
+      <w:start w:val="1"/>
+      <w:numFmt w:val="lowerLetter"/>
+      <w:lvlText w:val="%2)"/>
+      <w:lvlJc w:val="left"/>
+      <w:pPr>
+        <w:ind w:left="1080" w:hanging="440"/>
+      </w:pPr>
+    </w:lvl>
+    <w:lvl w:ilvl="2" w:tplc="0409001B" w:tentative="1">
+      <w:start w:val="1"/>
+      <w:numFmt w:val="lowerRoman"/>
+      <w:lvlText w:val="%3."/>
+      <w:lvlJc w:val="right"/>
+      <w:pPr>
+        <w:ind w:left="1520" w:hanging="440"/>
+      </w:pPr>
+    </w:lvl>
+    <w:lvl w:ilvl="3" w:tplc="0409000F" w:tentative="1">
+      <w:start w:val="1"/>
+      <w:numFmt w:val="decimal"/>
+      <w:lvlText w:val="%4."/>
+      <w:lvlJc w:val="left"/>
+      <w:pPr>
+        <w:ind w:left="1960" w:hanging="440"/>
+      </w:pPr>
+    </w:lvl>
+    <w:lvl w:ilvl="4" w:tplc="04090019" w:tentative="1">
+      <w:start w:val="1"/>
+      <w:numFmt w:val="lowerLetter"/>
+      <w:lvlText w:val="%5)"/>
+      <w:lvlJc w:val="left"/>
+      <w:pPr>
+        <w:ind w:left="2400" w:hanging="440"/>
+      </w:pPr>
+    </w:lvl>
+    <w:lvl w:ilvl="5" w:tplc="0409001B" w:tentative="1">
+      <w:start w:val="1"/>
+      <w:numFmt w:val="lowerRoman"/>
+      <w:lvlText w:val="%6."/>
+      <w:lvlJc w:val="right"/>
+      <w:pPr>
+        <w:ind w:left="2840" w:hanging="440"/>
+      </w:pPr>
+    </w:lvl>
+    <w:lvl w:ilvl="6" w:tplc="0409000F" w:tentative="1">
+      <w:start w:val="1"/>
+      <w:numFmt w:val="decimal"/>
+      <w:lvlText w:val="%7."/>
+      <w:lvlJc w:val="left"/>
+      <w:pPr>
+        <w:ind w:left="3280" w:hanging="440"/>
+      </w:pPr>
+    </w:lvl>
+    <w:lvl w:ilvl="7" w:tplc="04090019" w:tentative="1">
+      <w:start w:val="1"/>
+      <w:numFmt w:val="lowerLetter"/>
+      <w:lvlText w:val="%8)"/>
+      <w:lvlJc w:val="left"/>
+      <w:pPr>
+        <w:ind w:left="3720" w:hanging="440"/>
+      </w:pPr>
+    </w:lvl>
+    <w:lvl w:ilvl="8" w:tplc="0409001B" w:tentative="1">
+      <w:start w:val="1"/>
+      <w:numFmt w:val="lowerRoman"/>
+      <w:lvlText w:val="%9."/>
+      <w:lvlJc w:val="right"/>
+      <w:pPr>
+        <w:ind w:left="4160" w:hanging="440"/>
+      </w:pPr>
+    </w:lvl>
+  </w:abstractNum>
+  <w:num w:numId="1" w16cid:durableId="1576628411">
+    <w:abstractNumId w:val="3"/>
+  </w:num>
+  <w:num w:numId="2" w16cid:durableId="1808736741">
+    <w:abstractNumId w:val="0"/>
+  </w:num>
+  <w:num w:numId="3" w16cid:durableId="70473665">
+    <w:abstractNumId w:val="1"/>
+  </w:num>
+  <w:num w:numId="4" w16cid:durableId="687950091">
+    <w:abstractNumId w:val="2"/>
+  </w:num>
+  <w:num w:numId="5" w16cid:durableId="390542585">
+    <w:abstractNumId w:val="4"/>
+  </w:num>
+  <w:num w:numId="6" w16cid:durableId="104084521">
+    <w:abstractNumId w:val="2"/>
+    <w:lvlOverride w:ilvl="0">
+      <w:startOverride w:val="1"/>
+    </w:lvlOverride>
+  </w:num>
+  <w:num w:numId="7" w16cid:durableId="82529539">
+    <w:abstractNumId w:val="2"/>
+    <w:lvlOverride w:ilvl="0">
+      <w:startOverride w:val="1"/>
+    </w:lvlOverride>
+  </w:num>
+</w:numbering>
 </file>
 
 <file path=word/styles.xml><?xml version="1.0" encoding="utf-8"?>
@@ -1139,18 +1462,18 @@
     <w:lsdException w:name="Unresolved Mention" w:semiHidden="1" w:unhideWhenUsed="1"/>
     <w:lsdException w:name="Smart Link" w:semiHidden="1" w:unhideWhenUsed="1"/>
   </w:latentStyles>
-  <w:style w:type="paragraph" w:default="1" w:styleId="Normal">
+  <w:style w:type="paragraph" w:default="1" w:styleId="a">
     <w:name w:val="Normal"/>
     <w:qFormat/>
     <w:rsid w:val="00C7042F"/>
   </w:style>
-  <w:style w:type="character" w:default="1" w:styleId="DefaultParagraphFont">
+  <w:style w:type="character" w:default="1" w:styleId="a0">
     <w:name w:val="Default Paragraph Font"/>
     <w:uiPriority w:val="1"/>
     <w:semiHidden/>
     <w:unhideWhenUsed/>
   </w:style>
-  <w:style w:type="table" w:default="1" w:styleId="TableNormal">
+  <w:style w:type="table" w:default="1" w:styleId="a1">
     <w:name w:val="Normal Table"/>
     <w:uiPriority w:val="99"/>
     <w:semiHidden/>
@@ -1165,13 +1488,13 @@
       </w:tblCellMar>
     </w:tblPr>
   </w:style>
-  <w:style w:type="numbering" w:default="1" w:styleId="NoList">
+  <w:style w:type="numbering" w:default="1" w:styleId="a2">
     <w:name w:val="No List"/>
     <w:uiPriority w:val="99"/>
     <w:semiHidden/>
     <w:unhideWhenUsed/>
   </w:style>
-  <w:style w:type="paragraph" w:styleId="Revision">
+  <w:style w:type="paragraph" w:styleId="a3">
     <w:name w:val="Revision"/>
     <w:hidden/>
     <w:uiPriority w:val="99"/>
@@ -1183,10 +1506,10 @@
       <w:jc w:val="left"/>
     </w:pPr>
   </w:style>
-  <w:style w:type="paragraph" w:styleId="Header">
+  <w:style w:type="paragraph" w:styleId="a4">
     <w:name w:val="header"/>
-    <w:basedOn w:val="Normal"/>
-    <w:link w:val="HeaderChar"/>
+    <w:basedOn w:val="a"/>
+    <w:link w:val="a5"/>
     <w:uiPriority w:val="99"/>
     <w:unhideWhenUsed/>
     <w:rsid w:val="00D6166B"/>
@@ -1204,10 +1527,10 @@
       <w:szCs w:val="18"/>
     </w:rPr>
   </w:style>
-  <w:style w:type="character" w:customStyle="1" w:styleId="HeaderChar">
-    <w:name w:val="Header Char"/>
-    <w:basedOn w:val="DefaultParagraphFont"/>
-    <w:link w:val="Header"/>
+  <w:style w:type="character" w:customStyle="1" w:styleId="a5">
+    <w:name w:val="页眉 字符"/>
+    <w:basedOn w:val="a0"/>
+    <w:link w:val="a4"/>
     <w:uiPriority w:val="99"/>
     <w:rsid w:val="00D6166B"/>
     <w:rPr>
@@ -1215,10 +1538,10 @@
       <w:szCs w:val="18"/>
     </w:rPr>
   </w:style>
-  <w:style w:type="paragraph" w:styleId="Footer">
+  <w:style w:type="paragraph" w:styleId="a6">
     <w:name w:val="footer"/>
-    <w:basedOn w:val="Normal"/>
-    <w:link w:val="FooterChar"/>
+    <w:basedOn w:val="a"/>
+    <w:link w:val="a7"/>
     <w:uiPriority w:val="99"/>
     <w:unhideWhenUsed/>
     <w:rsid w:val="00D6166B"/>
@@ -1236,16 +1559,53 @@
       <w:szCs w:val="18"/>
     </w:rPr>
   </w:style>
-  <w:style w:type="character" w:customStyle="1" w:styleId="FooterChar">
-    <w:name w:val="Footer Char"/>
-    <w:basedOn w:val="DefaultParagraphFont"/>
-    <w:link w:val="Footer"/>
+  <w:style w:type="character" w:customStyle="1" w:styleId="a7">
+    <w:name w:val="页脚 字符"/>
+    <w:basedOn w:val="a0"/>
+    <w:link w:val="a6"/>
     <w:uiPriority w:val="99"/>
     <w:rsid w:val="00D6166B"/>
     <w:rPr>
       <w:sz w:val="18"/>
       <w:szCs w:val="18"/>
     </w:rPr>
+  </w:style>
+  <w:style w:type="paragraph" w:styleId="a8">
+    <w:name w:val="List Paragraph"/>
+    <w:basedOn w:val="a"/>
+    <w:link w:val="a9"/>
+    <w:uiPriority w:val="34"/>
+    <w:qFormat/>
+    <w:rsid w:val="00B15CF0"/>
+    <w:pPr>
+      <w:ind w:firstLine="420"/>
+    </w:pPr>
+  </w:style>
+  <w:style w:type="paragraph" w:customStyle="1" w:styleId="criteria">
+    <w:name w:val="criteria"/>
+    <w:basedOn w:val="a8"/>
+    <w:link w:val="criteria0"/>
+    <w:qFormat/>
+    <w:rsid w:val="00B15CF0"/>
+    <w:pPr>
+      <w:numPr>
+        <w:numId w:val="4"/>
+      </w:numPr>
+      <w:ind w:left="255" w:firstLineChars="0" w:hanging="57"/>
+    </w:pPr>
+  </w:style>
+  <w:style w:type="character" w:customStyle="1" w:styleId="a9">
+    <w:name w:val="列表段落 字符"/>
+    <w:basedOn w:val="a0"/>
+    <w:link w:val="a8"/>
+    <w:uiPriority w:val="34"/>
+    <w:rsid w:val="00B15CF0"/>
+  </w:style>
+  <w:style w:type="character" w:customStyle="1" w:styleId="criteria0">
+    <w:name w:val="criteria 字符"/>
+    <w:basedOn w:val="a9"/>
+    <w:link w:val="criteria"/>
+    <w:rsid w:val="00B15CF0"/>
   </w:style>
 </w:styles>
 </file>

</xml_diff>